<commit_message>
Update proposal with verified demo foundation and staged research evaluation
</commit_message>
<xml_diff>
--- a/project-materials/04_申报与答辩/申报书_教师反馈主线.docx
+++ b/project-materials/04_申报与答辩/申报书_教师反馈主线.docx
@@ -129,7 +129,7 @@
         <w:ind w:firstLine="480"/>
       </w:pPr>
       <w:r>
-        <w:t>本项目面向录播网课教师难以逐条整理弹幕、定位疑问和核查分析依据的问题，研究弹幕驱动的多模态教学反馈解析方法。前期复用已有弹幕分类、问题聚类与片段检索研究，接入开放模型和音视频处理模块，完成从获准材料导入到课程复盘报告、逐条证据查询及教师决定保存的基本系统。中期围绕三类高等数学视频各一课、每课约一万条弹幕开展人工标注，以实际错误为依据改进问题识别、摘要覆盖和局部音视频取证，并通过额外课程及教师任务检验效果。后期冻结高数模型，在计算机课程上检验迁移，再根据错误进行有限适配与持续试用。项目形成可运行软件、标注资料、判定规范和研究论文，为教师定位具体教学反馈、核查讲解材料及制定改进措施提供支持。</w:t>
+        <w:t>本项目面向录播网课教师整理弹幕、定位疑问和核查依据耗时的问题，研究弹幕驱动的多模态教学反馈解析方法。团队已实现课程素材获取、开放模型调用、单条证据回看与教师复核，并在约54分钟课程取得7200条弹幕，以前5分钟100条抽样完成本地报告闭环。研究以该基线为起点，围绕三类高等数学课程各约一万条弹幕开展人工标注，重点改进多问识别、条件保护聚合、有限篇幅下的问题覆盖与局部音视频取证。通过课程隔离测试、组件对照和教师任务实验，检验方法能否减少漏问、误归属与无据摘要。后期开展计算机课程迁移与校园部署验证，形成可复现系统、标注规范和研究成果，为教师保存有效讲解、回应具体疑问及制定改进措施提供支持。</w:t>
       </w:r>
     </w:p>
     <w:p>
@@ -199,7 +199,7 @@
         <w:ind w:firstLine="480"/>
       </w:pPr>
       <w:r>
-        <w:t>系统接收课程链接或内部课程标识，以及获准处理的视频、带播放位置的弹幕和用途记录。链接用于确认课程及其分集，材料取得采用平台允许的数据包、获批开放能力或来源与转交权限明确的导入方式；分片读取须在获准范围内进行。输入程序检查视频与弹幕是否属于同一课程，将时间统一到原视频起点，保存取得数量、有效数量和缺片情况。每条记录分配内部编号，后续摘要和图表均通过该编号回查原文。</w:t>
+        <w:t>系统以课程链接为入口，确认视频、分集和播放时长，获取当次可访问的弹幕快照及音视频，并记录取得时间、有效数量与缺失状态。现有原型已支持页面输入链接、按需扫码连接和分步骤获取反馈；研究数据纳入前另行核实处理、保存与展示权限，接口可访问不能代替研究授权。输入程序将时间统一到原视频起点，为每条弹幕分配内部编号，后续图表、问题清单和摘要均通过该编号回查原文。因为不同时间取得的快照可能不同，所以实验固定输入快照及抽样清单，不将重复获取结果直接混作同一数据集。</w:t>
       </w:r>
     </w:p>
     <w:p>
@@ -208,7 +208,7 @@
         <w:ind w:firstLine="480"/>
       </w:pPr>
       <w:r>
-        <w:t>音视频模块与弹幕模块分别处理同一课程。音视频模块将声音转为带时间的文字，提取板书或课件关键帧，识别公式与文字，再结合讲解内容建立章节、知识点和推导步骤。FrameScope拟通过适配层承担素材处理及时间定位；源码核验后保留可复用部分，对时间对齐、公式识别和错误记录不足之处进行补充。章节与知识点均保留原片位置，教师可合并、拆分或修正。</w:t>
+        <w:t>音视频模块与弹幕模块处理同一课程的两类证据。当前使用Whisper tiny生成带时间的转写，提取课程画面，再由Qwen3.5-4B结合固定五分钟窗内的文字与画面形成讲解概述；该结果是时间窗概述，尚不能称为自适应知识点分段。团队参考FrameScope的媒体处理与时间溯源设计，自行实现课镜处理链；已核验上游源码，当前仓库未直接复制其代码。中期将在现有转写与取帧基础上增加公式与术语纠错、知识点边界识别及教师修订，使每项内容证据保留原片位置和处理来源。</w:t>
       </w:r>
     </w:p>
     <w:p>
@@ -217,7 +217,7 @@
         <w:ind w:firstLine="480"/>
       </w:pPr>
       <w:r>
-        <w:t>弹幕模块使用开放权重指令模型，按照人工制定的定义抽取问题与求助、知识交流、理解状态自述、学习情绪、教学评价、改进建议六类标签，并指出各标签对应的原文短语。同条记录允许多个标签。仅有情绪宣泄的记录进入情绪视图；包含笼统求助或具体疑问的记录继续进入问题处理。格式校验失败时重试或进入待核列表，禁止通过删除难例使流程看似正常。</w:t>
+        <w:t>弹幕模块将模型推理组织为独立任务，先对输入记录进行六类多标签分类，再提取问题、组织概述并关联原文编号。当前本地模型已经完成该处理链，标签包括问题与求助、知识交流、理解自述、学习情绪、教学评价、改进建议，另保留积极表达及语义不明标记。同条记录允许多个标签。仅有情绪宣泄的记录保留在情绪视图；笼统求助与具体疑问进入问题清单。程序检查返回结构、编号范围和覆盖，对遗漏记录补处理，仍无法分类时显式保留待核记录。中期进一步标注标签对应短语及多问边界，检验规则补查与模型抽取各自造成的漏检和误报。</w:t>
       </w:r>
     </w:p>
     <w:p>
@@ -243,7 +243,7 @@
         <w:ind w:firstLine="480"/>
       </w:pPr>
       <w:r>
-        <w:t>定位首先从播放位置附近召回候选片段，再利用语义检索与重排序选择相关讲解。因为发言可能滞后，片段范围允许向前扩展；公式、代词或多个候选难以区分时，再读取关键板书帧或对应音频。结果记录所指知识点、候选区间及依据，证据不足时保留未归属或多个候选。中期将比较固定时间窗、时间加语义检索和按需补充音视频三种方法，检验额外证据是否减少误归属，以及新增调用是否值得。</w:t>
+        <w:t>当前原型按固定时间窗提供讲解上下文，中期拟从播放位置附近召回候选片段，再利用语义检索与重排序选择相关讲解。因为发言可能滞后，片段范围允许向前扩展；公式、代词或多个候选难以区分时，再读取关键板书帧或对应音频。结果记录所指知识点、候选区间及依据，证据不足时保留未归属或多个候选。中期将比较固定时间窗、时间加语义检索和按需补充音视频三种方法，检验额外证据是否减少误归属，以及新增调用是否值得。</w:t>
       </w:r>
     </w:p>
     <w:p>
@@ -296,7 +296,16 @@
         <w:ind w:firstLine="480"/>
       </w:pPr>
       <w:r>
-        <w:t>教师按“全课概览—课程地图—问题全景—证据复盘—行动清单”阅读。首页突出知识点数和教学相关弹幕数，六类入口并列；课程地图对齐内容摘要、知识点与反馈分布；问题区提供分层概述、精确频数和可点击词云。点击任何分析结果，均可进入对应问题及单条原文，再查看相关讲解。教师保存保留、补充、修改或暂不处理的决定，相关修订触发受影响部分重新统计和生成。</w:t>
+        <w:t>教师按“全课概览—课程地图—问题全景—证据复盘—行动清单”阅读。现有界面已支持反馈入口、问题概述与词云、单条弹幕回看以及复核记录保存；课程地图目前使用时间窗概述，中期将替换为经过验证的知识点区间。教师可导入大纲原文，系统按段落保留，再结合讲解证据与反馈组织对应分析；真实大纲的匹配质量尚需教师核验。中期将完善“目标—讲解—反馈—建议”之间的证据关联及修订后的局部重新生成，避免将未提供的大纲目标或未核验的讲解内容写成事实。</w:t>
+      </w:r>
+    </w:p>
+    <w:p>
+      <w:pPr>
+        <w:widowControl/>
+        <w:ind w:firstLine="480"/>
+      </w:pPr>
+      <w:r>
+        <w:t>系统将模型连接检查与分析任务执行分开：远程接口须先通过所需文本或图文验证，本地模式检查服务可用性，连接失效时前后端均阻止新任务启动。任务失败保留原因与已完成结果，历史报告显示其生成来源。API作为常用部署方式，本地模式支持已下载素材的离线处理，校园服务器预留为在校师生提供日常教学辅学服务的部署方向。三种方式共享输入输出结构，便于在相同材料、提示与评价程序下比较效果、耗时及调用成本。</w:t>
       </w:r>
     </w:p>
     <w:p>
@@ -316,7 +325,7 @@
       <w:r>
         <w:drawing>
           <wp:inline xmlns:a="http://schemas.openxmlformats.org/drawingml/2006/main" xmlns:pic="http://schemas.openxmlformats.org/drawingml/2006/picture">
-            <wp:extent cx="5040000" cy="3735446"/>
+            <wp:extent cx="5040000" cy="6386350"/>
             <wp:docPr id="1" name="Picture 1"/>
             <wp:cNvGraphicFramePr>
               <a:graphicFrameLocks noChangeAspect="1"/>
@@ -337,7 +346,7 @@
                   <pic:spPr>
                     <a:xfrm>
                       <a:off x="0" y="0"/>
-                      <a:ext cx="5040000" cy="3735446"/>
+                      <a:ext cx="5040000" cy="6386350"/>
                     </a:xfrm>
                     <a:prstGeom prst="rect"/>
                   </pic:spPr>
@@ -383,7 +392,7 @@
       <w:r>
         <w:drawing>
           <wp:inline xmlns:a="http://schemas.openxmlformats.org/drawingml/2006/main" xmlns:pic="http://schemas.openxmlformats.org/drawingml/2006/picture">
-            <wp:extent cx="5652000" cy="1198224"/>
+            <wp:extent cx="5652000" cy="1170141"/>
             <wp:docPr id="2" name="Picture 2"/>
             <wp:cNvGraphicFramePr>
               <a:graphicFrameLocks noChangeAspect="1"/>
@@ -404,7 +413,7 @@
                   <pic:spPr>
                     <a:xfrm>
                       <a:off x="0" y="0"/>
-                      <a:ext cx="5652000" cy="1198224"/>
+                      <a:ext cx="5652000" cy="1170141"/>
                     </a:xfrm>
                     <a:prstGeom prst="rect"/>
                   </pic:spPr>
@@ -430,7 +439,7 @@
         <w:pStyle w:val="Heading2"/>
       </w:pPr>
       <w:r>
-        <w:t>5.1 申报前完成基本系统</w:t>
+        <w:t>5.1 申报前形成可复现基线并完成针对性核查</w:t>
       </w:r>
     </w:p>
     <w:p>
@@ -439,7 +448,7 @@
         <w:ind w:firstLine="480"/>
       </w:pPr>
       <w:r>
-        <w:t>前期以已有研究方法、开放模型及音视频项目为基础，先完成材料导入、模型调用和统一数据结构，再实现逐条分类、多问拆分、片段关联、问题聚合和报告交互。文本理解、语音转写、画面识别及语义检索分别提供服务，按固定处理顺序交换结构化结果；更换某个模型时，其余数据接口保持一致。此阶段优先完成已有方法的集成，不依赖专门微调才能运行。</w:t>
+        <w:t>前期已完成从真实素材到本地报告的基本处理链。后续申报前工作以现有原型、固定快照和已发现错误为基础，优先修复远程接口参数兼容问题，补充异常恢复、模型配置及结果来源记录，使同一课程在明确范围内稳定生成问题清单、讲解概述和可回查报告。完整课程素材处理与模型实际分析范围分别记录，避免用全课下载或转写替代全课语义分析。</w:t>
       </w:r>
     </w:p>
     <w:p>
@@ -448,7 +457,7 @@
         <w:ind w:firstLine="480"/>
       </w:pPr>
       <w:r>
-        <w:t>选取三类高数课程的获准材料，先用短片段检查时间对齐、公式识别及证据跳转，再完成整课处理。人工检查300—500条不同位置和类型的弹幕，其中先用200—300条试标完善定义，重点纳入多问、无问号求助、纯情绪、肯定反馈和反讽。通过逐条对照原文与输出，记录分类、归属和摘要错误，为中期决定训练任务提供依据。</w:t>
+        <w:t>当前100条试验用于确认输入输出链路，不能用于估计自然反馈比例。下一步在固定快照上按时间段抽取未经文本去重的自然分布样本，另行加入多问、无问号求助、纯情绪、肯定反馈及反讽等难例，人工检查300—500条记录；其中先以200—300条试标完善定义。自然样本与补充难例分开统计，通过核对原文、输出及相关讲解，形成分类、问题抽取、片段定位和摘要错误清单。</w:t>
       </w:r>
     </w:p>
     <w:p>
@@ -457,7 +466,7 @@
         <w:ind w:firstLine="480"/>
       </w:pPr>
       <w:r>
-        <w:t>前期交付应包含真实课程报告、逐条证据索引、可保存的教师操作、运行配置及复现说明。另一名成员使用同一素材重新运行，核对数量、引用和操作保存。完成标准是输入材料经过实际模型生成全部计划输出，合成界面仅用于交互说明。当前尚未形成真实运行结果；若素材或接口未落实，须据实记录尚未完成的部分。</w:t>
+        <w:t>申报前基线保留输入快照、抽样索引、模型及提示版本、输出证据编号和教师操作记录，由另一名成员在相同材料上复现。已完成的本地短片段报告作为技术可行性依据；远程全链路、全课语义分析、真实教师大纲和三课数据准备按实际完成情况记录。中期研究由该基线与试标结果启动，无需等待专门训练权重才能开展。</w:t>
       </w:r>
     </w:p>
     <w:p>
@@ -474,7 +483,7 @@
         <w:ind w:firstLine="480"/>
       </w:pPr>
       <w:r>
-        <w:t>中期以已运行的基础系统、试标规则和错误记录为基础，围绕复习速通、专题讲解、解题方法三类高数视频各一课开展标注，每课目标约一万条，共约三万条。全部记录进行教学相关性、六类标签和教学对象的基础标注，由两名成员独立判断并仲裁分歧。所有问题候选进一步标注原文范围、所问对象、条件、否定、问题拆分和课程片段；还需抽查被模型判为非问题的记录，以估计早期漏检。</w:t>
+        <w:t>中期以已运行的基础系统、试标规则和错误记录为基础，围绕复习速通、专题讲解、解题方法三类高数视频各一课开展标注，每课目标约一万条，共约三万条。每课约一万条为选材目标，以实际获准快照数量为准，不通过补造或重复记录凑足规模。全部记录进行教学相关性、六类标签和教学对象的基础标注，由两名成员独立判断并仲裁分歧。所有问题候选进一步标注原文范围、所问对象、条件、否定、问题拆分和课程片段；还需抽查被模型判为非问题的记录，以估计早期漏检。</w:t>
       </w:r>
     </w:p>
     <w:p>
@@ -510,7 +519,7 @@
         <w:ind w:firstLine="480"/>
       </w:pPr>
       <w:r>
-        <w:t>模型评价围绕教师任务选择指标：问题单元召回检验漏问，精确率检验虚构问题，条件保留与错误合并检验聚合，片段关联与拒判比例检验定位，摘要覆盖与证据支持检验报告。另抽取300—500项报告主张进行发现级核验，将自然分布样本与补充难例分开报告。拟先邀请3—5名教师或助教进行形成性试用，再规划8—12名参与者开展任务评价，人数根据招募和试点结果调整。</w:t>
+        <w:t>模型评价围绕教师任务选择指标：问题单元召回检验漏问，精确率检验虚构问题，条件保留与错误合并检验聚合，片段关联与拒判比例检验定位，摘要覆盖与证据支持检验报告。各指标同时报告分子、分母及课程级结果，置信区间以课程或独立任务为抽样单位；同视频弹幕不能视为大量独立课程证据。对比时固定输入、分析范围、提示版本和生成字数，另报告缓存未命中时的处理耗时、调用次数及实际返回用量。另抽取300—500项报告主张进行发现级核验，将自然分布样本与补充难例分开报告。拟先邀请3—5名教师或助教进行形成性试用，再规划8—12名参与者开展任务评价，人数根据招募和试点结果调整。</w:t>
       </w:r>
     </w:p>
     <w:p>
@@ -589,7 +598,25 @@
         <w:ind w:firstLine="480"/>
       </w:pPr>
       <w:r>
-        <w:t>团队由大连理工大学软件学院四名本科生组成，目前已完成需求整理、相关文献阅读、反馈判定规则、数据结构和报告示意设计。FrameScope目前具有项目说明，源码、依赖和复用许可尚待核验；真实数据接入、模型部署及教师试用尚待实施。团队具备租用云GPU的条件，具体配置根据加载、吞吐和费用实测确定。已有基础能够支持方案开发，但不能替代真实运行和实验结果。</w:t>
+        <w:t>团队由大连理工大学软件学院四名本科生组成，已完成文献整理、判定规则、数据结构、工作台开发及真实素材试验。以BV1Y2DGYoEEw课程为例，已取得约54分钟含音轨视频与7200条带播放时间的弹幕，生成1506段转写草稿及28张画面。在前五分钟范围内，团队从去重文本中按时间等间隔选取100条弹幕，结合153段完整落入该范围的转写和3张画面，使用Qwen3.5-4B完成本地报告生成，得到23个问题单元、25个词云词项和7条积极表达候选。试验记录与抽样范围已保存，可从报告回查单条原文。</w:t>
+      </w:r>
+    </w:p>
+    <w:p>
+      <w:pPr>
+        <w:widowControl/>
+        <w:ind w:firstLine="480"/>
+      </w:pPr>
+      <w:r>
+        <w:t>试验确认了数据获取、模型输出、程序统计和交互回看的连通性，也暴露出具体研究问题：模型曾将“初中物竞可以食用吗”按字面概括为是否可食用，并出现疑问与积极表达误分类，数学转写亦存在术语错误。因此，现有数量仅说明系统产生了相应记录，不能作为准确率或教学效用证据。中期将以这些错误为起点构建难例与对照实验，重点检查上下文补充是否真正纠正误解，还是引入学生未表达的信息。</w:t>
+      </w:r>
+    </w:p>
+    <w:p>
+      <w:pPr>
+        <w:widowControl/>
+        <w:ind w:firstLine="480"/>
+      </w:pPr>
+      <w:r>
+        <w:t>远程API已完成真实模型目录查询和合成文本调用验证，但一次真实课程分析返回参数或能力不匹配，完整远程报告尚待验证。校园模式目前仅完成入口与控制逻辑，未进行真实接入试验；教师大纲尚缺少真实使用评价。FrameScope源码及来源已核验，代码直接复用许可仍需明确。团队具备租用云GPU的条件，可根据标注和基线测试结果选择模型及算力，当前尚未训练专用适配权重。</w:t>
       </w:r>
     </w:p>
     <w:p>
@@ -615,7 +642,7 @@
         <w:ind w:firstLine="480"/>
       </w:pPr>
       <w:r>
-        <w:t>前期计划在申报前完成基本系统和少量真实核查；2026年9月下旬至2027年3月中期检查前集中完成标注、模型优化、方法实验和教师评价；中期后进行课程迁移、持续试用和成果整理。执行起止时间以正式立项安排为准，并在团队成员毕业前结题。</w:t>
+        <w:t>前期在现有本地闭环基础上稳定系统并完成少量真实核查；2026年9月下旬至2027年3月中期检查前集中完成标注、模型优化、方法实验和教师评价；中期后进行课程迁移、持续试用和成果整理。执行起止时间以正式立项安排为准，并在团队成员毕业前结题。</w:t>
       </w:r>
     </w:p>
     <w:p>

</xml_diff>

<commit_message>
Build owned course platform and independent audiovisual feedback pipeline
</commit_message>
<xml_diff>
--- a/project-materials/04_申报与答辩/申报书_教师反馈主线.docx
+++ b/project-materials/04_申报与答辩/申报书_教师反馈主线.docx
@@ -32,7 +32,7 @@
         <w:widowControl/>
       </w:pPr>
       <w:r>
-        <w:t>项目名称：面向录播网课的弹幕驱动多模态教学反馈解析与教师复盘系统</w:t>
+        <w:t>项目名称：面向自有网课平台的多模态教学反馈解析与教师复盘系统</w:t>
       </w:r>
     </w:p>
     <w:p>
@@ -129,7 +129,7 @@
         <w:ind w:firstLine="480"/>
       </w:pPr>
       <w:r>
-        <w:t>本项目面向录播网课教师整理弹幕、定位疑问和核查依据耗时的问题，研究弹幕驱动的多模态教学反馈解析方法。团队已实现课程素材获取、开放模型调用、单条证据回看与教师复核，并在约54分钟课程取得7200条弹幕，以前5分钟100条抽样完成本地报告闭环。研究以该基线为起点，围绕三类高等数学课程各约一万条弹幕开展人工标注，重点改进多问识别、条件保护聚合、有限篇幅下的问题覆盖与局部音视频取证。通过课程隔离测试、组件对照和教师任务实验，检验方法能否减少漏问、误归属与无据摘要。后期开展计算机课程迁移与校园部署验证，形成可复现系统、标注规范和研究成果，为教师保存有效讲解、回应具体疑问及制定改进措施提供支持。</w:t>
+        <w:t>本项目建设集视频上传、播放与弹幕互动于一体的网课教学平台，研究基于平台内反馈的多模态教师复盘方法。教师上传具有相应使用权的课程，学生在播放位置提问和交流，系统以明确的分析选择形成固定快照，结合课程转写、证据画面和教学大纲生成可回查报告。团队已完成平台基本功能及自制短课程的本地模型闭环。中期通过真实课程逐步积累反馈并开展人工标注，重点研究多问识别、条件保护聚合、摘要覆盖与讲解片段定位，通过独立课程和教师任务检验效果。后期开展计算机课程迁移及校园部署试点，外部视频平台保留为授权合作扩展。项目形成可复现平台、标注规范和研究成果，为教师回应具体疑问、保存有效讲解及制定改进措施提供支持。</w:t>
       </w:r>
     </w:p>
     <w:p>
@@ -138,7 +138,7 @@
         <w:pageBreakBefore/>
       </w:pPr>
       <w:r>
-        <w:t>三 研究问题与前人基础</w:t>
+        <w:t>三 研究问题与已有研究</w:t>
       </w:r>
     </w:p>
     <w:p>
@@ -147,7 +147,7 @@
         <w:ind w:firstLine="480"/>
       </w:pPr>
       <w:r>
-        <w:t>录播网课的弹幕与视频播放位置关联，能够记录观看者对某个概念、推导步骤或例题的即时表达。教师需要据此回答三个相互衔接的问题：课程中出现了哪些需要回应的信息需求，反馈具体指向哪段讲解，哪些讲解值得保留或修改。实际使用中，一条弹幕可能同时包含情绪、多个问题和评价；同一知识点还可能在不同位置反复出现。因为材料零散且表达简短，所以教师逐条回看耗时，直接生成整课摘要又容易遗漏低频问题和关键条件。</w:t>
+        <w:t>录播教学中的学生反馈分散在不同播放位置。教师需要知道学生提出了哪些不同问题、问题指向哪段讲解，以及哪些内容值得保留或补充。一条弹幕可能同时包含理解自述、情绪和多个问题，直接生成整课摘要容易合并不同条件或遗漏低频疑问。因此，本项目将课程播放与反馈形成纳入自有平台，再研究如何把原始表达组织为便于教师核查的证据。</w:t>
       </w:r>
     </w:p>
     <w:p>
@@ -156,7 +156,7 @@
         <w:ind w:firstLine="480"/>
       </w:pPr>
       <w:r>
-        <w:t>已有研究为系统的基本实现提供了明确基础。Cai与Wei对教育视频弹幕中的认知参与进行了分析，提供了按播放位置研究反馈的先例[1]。CoKnowledge将弹幕分类、聚类和视频关联组成处理流程，并通过分层浏览支持观看者理解集体知识[2]。本项目复用其信息组织思路，先建立逐条解析、问题归并和课程定位能力，再将使用任务转向教师复盘。研究成果的复用依据公开方法、代码或权重的实际可得性与许可分别落实。</w:t>
+        <w:t>Cai与Wei对教育视频弹幕认知参与的研究为反馈分类提供先例[1]。CoKnowledge通过分类、聚类与视频关联组织时间同步评论，为多层次浏览提供参照[2]。EduRABSA将教育评论中的评价方面与倾向分开，适用于同时包含肯定和改进意见的表达[3]；有依据的学生反馈摘要研究支持将分类、聚类和检索结合[4]。本项目借鉴这些处理与交互方法，将使用任务转向教师复盘，并通过自有课程形成可记录来源的反馈。</w:t>
       </w:r>
     </w:p>
     <w:p>
@@ -165,7 +165,7 @@
         <w:ind w:firstLine="480"/>
       </w:pPr>
       <w:r>
-        <w:t>EduRABSA将教育评论中的评价方面、观点及倾向分开处理，为“例题清楚但节奏太快”等混合表达提供方法参考[3]。EduFeedback-RAG通过分类、聚类和检索支持反馈摘要，为报告生成提供基础流程[4]。MOOC-Rec研究问题与教学视频片段的关联，PedagogyBench提供教学视频理解任务，二者支持将讲解内容纳入问题定位和模型评价[5–6]。这些研究的数据、语言和使用者与中文高数弹幕存在差异，所以需要人工标注及独立课程检验，不能直接采用其原有成绩作为本项目效果。</w:t>
+        <w:t>MOOC-Rec与PedagogyBench分别提供问题关联教学片段及教学视频理解的研究参照[5–6]。学习分析仪表盘评价研究强调从使用任务检验系统价值[7]，引用生成研究则提示需要分别检查引用完整性及其语义支持[8]。这些研究的数据与场景不同，原有成绩不能直接作为中文高数课程的分析效果。</w:t>
       </w:r>
     </w:p>
     <w:p>
@@ -174,7 +174,7 @@
         <w:ind w:firstLine="480"/>
       </w:pPr>
       <w:r>
-        <w:t>本项目集中研究“有限阅读篇幅下，如何保留更多不同问题，并为教师提供足够且准确的课程证据”。其中，六类反馈、词云和时间轴承担基本信息组织；问题单元保留、条件保护聚合和按需取证承担方法研究；教师任务实验检验这些改进是否帮助实际复盘。Kaliisa等对学习分析仪表盘全流程评价的研究为此提供参照[7]。通过将每个方法改动对应到具体错误和教师任务，明确系统组合带来的收益及各组件的作用。</w:t>
+        <w:t>项目集中研究有限阅读篇幅下的问题覆盖与证据定位。上传、播放器和账号系统提供研究环境；多问拆分、条件保护聚合和有据摘要承担方法研究；教师任务实验检验这些改动能否减少遗漏和错误采纳。自建平台不会自动消除版权问题，课程素材及学生数据仍需核实相应处理范围。</w:t>
       </w:r>
     </w:p>
     <w:p>
@@ -182,7 +182,7 @@
         <w:pStyle w:val="Heading1"/>
       </w:pPr>
       <w:r>
-        <w:t>四 系统运行与核心研究方法</w:t>
+        <w:t>四 平台运行与研究方法</w:t>
       </w:r>
     </w:p>
     <w:p>
@@ -190,7 +190,7 @@
         <w:pStyle w:val="Heading2"/>
       </w:pPr>
       <w:r>
-        <w:t>4.1 从课程材料到逐条反馈</w:t>
+        <w:t>4.1 课程上传与平台反馈形成</w:t>
       </w:r>
     </w:p>
     <w:p>
@@ -199,7 +199,7 @@
         <w:ind w:firstLine="480"/>
       </w:pPr>
       <w:r>
-        <w:t>系统以课程链接为入口，确认视频、分集和播放时长，获取当次可访问的弹幕快照及音视频，并记录取得时间、有效数量与缺失状态。现有原型已支持页面输入链接、按需扫码连接和分步骤获取反馈；研究数据纳入前另行核实处理、保存与展示权限，接口可访问不能代替研究授权。输入程序将时间统一到原视频起点，为每条弹幕分配内部编号，后续图表、问题清单和摘要均通过该编号回查原文。因为不同时间取得的快照可能不同，所以实验固定输入快照及抽样清单，不将重复获取结果直接混作同一数据集。</w:t>
+        <w:t>教师上传视频及可选教学大纲，确认课程视频、课件与音轨的相应使用权，校验视频后保存草稿，再决定发布。首期不设置班级、邀请码或选课环节，已发布课程向平台注册用户开放；教师只可管理和分析自己上传的课程，草稿仅本人可见。学生在播放器当前时刻发送弹幕，平台保存内部编号、文字、播放位置和发送时间。</w:t>
       </w:r>
     </w:p>
     <w:p>
@@ -208,7 +208,15 @@
         <w:ind w:firstLine="480"/>
       </w:pPr>
       <w:r>
-        <w:t>音视频模块与弹幕模块处理同一课程的两类证据。当前使用Whisper tiny生成带时间的转写，提取课程画面，再由Qwen3.5-4B结合固定五分钟窗内的文字与画面形成讲解概述；该结果是时间窗概述，尚不能称为自适应知识点分段。团队参考FrameScope的媒体处理与时间溯源设计，自行实现课镜处理链；已核验上游源码，当前仓库未直接复制其代码。中期将在现有转写与取帧基础上增加公式与术语纠错、知识点边界识别及教师修订，使每项内容证据保留原片位置和处理来源。</w:t>
+        <w:t>观看和互动不以同意模型分析为前提。弹幕发送时单独选择是否用于本地反馈分析，教师生成报告前冻结已同意且未撤回的记录，保留快照与原弹幕编号映射。新弹幕继续进入平台，留待后续快照分析，避免运行过程中输入变化。撤回后旧报告暂停访问，重新生成时排除相应记录；正式试点前进一步落实历史缓存的保留与删除程序。</w:t>
+      </w:r>
+    </w:p>
+    <w:p>
+      <w:pPr>
+        <w:pStyle w:val="Heading2"/>
+      </w:pPr>
+      <w:r>
+        <w:t>4.2 独立音视频证据模块</w:t>
       </w:r>
     </w:p>
     <w:p>
@@ -217,15 +225,7 @@
         <w:ind w:firstLine="480"/>
       </w:pPr>
       <w:r>
-        <w:t>弹幕模块将模型推理组织为独立任务，先对输入记录进行六类多标签分类，再提取问题、组织概述并关联原文编号。当前本地模型已经完成该处理链，标签包括问题与求助、知识交流、理解自述、学习情绪、教学评价、改进建议，另保留积极表达及语义不明标记。同条记录允许多个标签。仅有情绪宣泄的记录保留在情绪视图；笼统求助与具体疑问进入问题清单。程序检查返回结构、编号范围和覆盖，对遗漏记录补处理，仍无法分类时显式保留待核记录。中期进一步标注标签对应短语及多问边界，检验规则补查与模型抽取各自造成的漏检和误报。</w:t>
-      </w:r>
-    </w:p>
-    <w:p>
-      <w:pPr>
-        <w:pStyle w:val="Heading2"/>
-      </w:pPr>
-      <w:r>
-        <w:t>4.2 从问题单元到课程证据</w:t>
+        <w:t>音视频模块以课程MP4和选定范围为输入，先取得媒体时长，再提取单声道语音并分块转写。相邻语音块保留少量重叠上下文，按句段中点归属，输出起止时间、文字及识别分数；缓存记录媒体与语音模型权重哈希，使重复运行可核对输入来源。当前使用Whisper开放模型完成本地转写，分数只作复核线索，不能证明公式和数学术语正确。</w:t>
       </w:r>
     </w:p>
     <w:p>
@@ -234,7 +234,7 @@
         <w:ind w:firstLine="480"/>
       </w:pPr>
       <w:r>
-        <w:t>问题处理以可辨识的信息需求为单位。例如，示例弹幕“为什么能约掉x，x=0怎么办”包含约分依据与零值情形两个问题，系统应分别记录，两者都链接原文。对于“这里没懂，求再讲一遍”，保留笼统求助及其时间位置；音视频用于寻找可能指向的内容，不能代替学生补写一个未表达的具体问题。</w:t>
+        <w:t>画面处理每五秒取得一个采样帧，利用缩小后的灰度变化产生候选分界，限制片段最短三十秒、最长一百八十秒，再从候选片段解码代表画面并保存实际帧时间。模型结合该片段转写与画面概述讲解内容，输出可回查的证据编号。画面变化仅是候选线索，板书持续书写、人物运动和静态课件均可能造成误分或漏分。</w:t>
       </w:r>
     </w:p>
     <w:p>
@@ -243,7 +243,15 @@
         <w:ind w:firstLine="480"/>
       </w:pPr>
       <w:r>
-        <w:t>当前原型按固定时间窗提供讲解上下文，中期拟从播放位置附近召回候选片段，再利用语义检索与重排序选择相关讲解。因为发言可能滞后，片段范围允许向前扩展；公式、代词或多个候选难以区分时，再读取关键板书帧或对应音频。结果记录所指知识点、候选区间及依据，证据不足时保留未归属或多个候选。中期将比较固定时间窗、时间加语义检索和按需补充音视频三种方法，检验额外证据是否减少误归属，以及新增调用是否值得。</w:t>
+        <w:t>中期以人工标注的知识点与推导步骤为标准，比较固定时间窗、画面变化候选和语义辅助分段，针对公式或指代不清的问题按需补充局部画面与音频。通过记录补证前后的关联变化及处理成本，判断哪些材料有助于纠错，哪些材料引入了无依据解释。该模块围绕当前课程任务独立设计，不以外部音视频项目的功能作为前置基础。</w:t>
+      </w:r>
+    </w:p>
+    <w:p>
+      <w:pPr>
+        <w:pStyle w:val="Heading2"/>
+      </w:pPr>
+      <w:r>
+        <w:t>4.3 从弹幕问题到有依据的报告</w:t>
       </w:r>
     </w:p>
     <w:p>
@@ -252,15 +260,7 @@
         <w:ind w:firstLine="480"/>
       </w:pPr>
       <w:r>
-        <w:t>归并问题时，同义表达可以组成问题簇；对象相同但条件、否定或所求信息不同的记录分别保留。例如，“何时可以约分”与“零值为何不能约分”可以关联同一主题，但其信息需求不能因词语接近而丢失。聚合后的完整清单保留全部已识别问题单元，包括单次提问、笼统求助和待核项。程序检查每个问题编号是否仍可访问，从而发现处理环节造成的丢失；人工评价另行检查模型最初是否漏识别问题。</w:t>
-      </w:r>
-    </w:p>
-    <w:p>
-      <w:pPr>
-        <w:pStyle w:val="Heading2"/>
-      </w:pPr>
-      <w:r>
-        <w:t>4.3 从证据核查到教师报告</w:t>
+        <w:t>反馈首先按照问题与求助、知识交流、理解自述、学习情绪、教学评价、改进建议六类进行多标签分析，同时保留积极表达及语义不明项。纯情绪记录进入情绪视图；笼统求助与具体问题进入问题清单。程序核验输出结构、编号范围和覆盖，对未处理记录保留明确状态，不能通过删除难例掩盖错误。</w:t>
       </w:r>
     </w:p>
     <w:p>
@@ -269,7 +269,7 @@
         <w:ind w:firstLine="480"/>
       </w:pPr>
       <w:r>
-        <w:t>报告的教学判断按概念与适用条件、推理衔接、例题与方法、结构节奏、音画资料五个方面组织。教育部在线课程文件提供上层关注范围，Quality Matters提供目标、材料与活动协调关系的参照[9–10]；具体规则根据本项目可取得的弹幕和课程材料制定。六类标签回答“表达了什么”，五个方面回答“针对哪项教学处理”，均不相加形成课程总分。</w:t>
+        <w:t>问题单元以可辨识的信息需求为单位。例如“为什么能约掉x，x等于零怎么办”应分别保留约分依据与零值情形，两者均关联原文。归并时可以合并同义表达，但对象、条件、否定或所求内容不同的问题应保持可区分。摘要在相同字数预算下优先覆盖不同需求，首页未展示的问题仍保留在完整列表；人工评价同时检查模型最初的漏检和聚合后的语义遗漏。</w:t>
       </w:r>
     </w:p>
     <w:p>
@@ -278,7 +278,7 @@
         <w:ind w:firstLine="480"/>
       </w:pPr>
       <w:r>
-        <w:t>每项发现分别记录反馈依据、内容核验和教师复核状态。继续以前述约分问题为例：弹幕支持“有人询问约分条件”；系统再回查讲解中是否出现非零条件。若条件已经说明，报告显示具体位置，并将“条件不够醒目或前置知识不足”列为候选解释；若检查范围内未找到说明，则提出待教师核查的问题，不能直接声称整课漏讲。针对例题的明确肯定反馈可支持保留建议；单独出现“懂了”仅作为理解自述统计。</w:t>
+        <w:t>问题定位先利用播放位置召回候选讲解，再比较语义及必要的画面证据。发言可能滞后，所以允许向前扩展范围；候选难以区分时保留多个位置或暂不归属。弹幕支持“有人询问某条件”，不能直接支持“教师漏讲”或“学生没有掌握”。教学大纲原文加入后，进一步检查目标、讲解材料与反馈线索之间的对应，不将材料对应写成目标已经达成。</w:t>
       </w:r>
     </w:p>
     <w:p>
@@ -287,7 +287,7 @@
         <w:ind w:firstLine="480"/>
       </w:pPr>
       <w:r>
-        <w:t>报告生成前，程序计算各时间段的弹幕密度、各类条数、问题支持条数及未知数量。生成模型从问题簇和核验材料中组织摘要，每项主张保留引用，并区分观察、候选解释和行动建议。参考有引用文本生成研究[8]，分别检查引用是否支持主张以及摘要是否覆盖重要信息；引用编号存在只完成结构检查，语义支持仍需独立核验。</w:t>
+        <w:t>报告按课程概览、讲解片段、问题全景、证据复盘和行动记录组织。教学观察围绕概念与条件、推理衔接、例题方法、结构节奏和音画资料展开；教育部在线课程文件与Quality Matters提供上层关注范围[9–10]，具体指标需要结合平台材料验证。六类标签与教学方面分别回答表达类型和针对对象，不相加生成课程质量总分。</w:t>
       </w:r>
     </w:p>
     <w:p>
@@ -296,25 +296,7 @@
         <w:ind w:firstLine="480"/>
       </w:pPr>
       <w:r>
-        <w:t>教师按“全课概览—课程地图—问题全景—证据复盘—行动清单”阅读。现有界面已支持反馈入口、问题概述与词云、单条弹幕回看以及复核记录保存；课程地图目前使用时间窗概述，中期将替换为经过验证的知识点区间。教师可导入大纲原文，系统按段落保留，再结合讲解证据与反馈组织对应分析；真实大纲的匹配质量尚需教师核验。中期将完善“目标—讲解—反馈—建议”之间的证据关联及修订后的局部重新生成，避免将未提供的大纲目标或未核验的讲解内容写成事实。</w:t>
-      </w:r>
-    </w:p>
-    <w:p>
-      <w:pPr>
-        <w:widowControl/>
-        <w:ind w:firstLine="480"/>
-      </w:pPr>
-      <w:r>
-        <w:t>系统将模型连接检查与分析任务执行分开：远程接口须先通过所需文本或图文验证，本地模式检查服务可用性，连接失效时前后端均阻止新任务启动。任务失败保留原因与已完成结果，历史报告显示其生成来源。API作为常用部署方式，本地模式支持已下载素材的离线处理，校园服务器预留为在校师生提供日常教学辅学服务的部署方向。三种方式共享输入输出结构，便于在相同材料、提示与评价程序下比较效果、耗时及调用成本。</w:t>
-      </w:r>
-    </w:p>
-    <w:p>
-      <w:pPr>
-        <w:widowControl/>
-        <w:ind w:firstLine="480"/>
-      </w:pPr>
-      <w:r>
-        <w:t>技术路线如图1所示。音视频与弹幕分别产生内容证据和反馈证据，经过关联与核验后汇入报告；人工标注用于研究评价，教师修订用于实际使用。缺失材料、识别失败与无法判断均保留明确状态。</w:t>
+        <w:t>图表中的数量由程序计算，模型负责问题概述和有据解释；每项观察与建议保留引用，教师可点击查看单条原文及相关讲解。程序检查编号存在，独立评价检查引用是否支持结论。平台支持本地推理；API仅分析学生同意指定服务的反馈，并须教师确认课程材料范围。真实远程链路与校园部署待验证。</w:t>
       </w:r>
     </w:p>
     <w:p>
@@ -325,7 +307,7 @@
       <w:r>
         <w:drawing>
           <wp:inline xmlns:a="http://schemas.openxmlformats.org/drawingml/2006/main" xmlns:pic="http://schemas.openxmlformats.org/drawingml/2006/picture">
-            <wp:extent cx="5040000" cy="6386350"/>
+            <wp:extent cx="5040000" cy="6316449"/>
             <wp:docPr id="1" name="Picture 1"/>
             <wp:cNvGraphicFramePr>
               <a:graphicFrameLocks noChangeAspect="1"/>
@@ -346,7 +328,7 @@
                   <pic:spPr>
                     <a:xfrm>
                       <a:off x="0" y="0"/>
-                      <a:ext cx="5040000" cy="6386350"/>
+                      <a:ext cx="5040000" cy="6316449"/>
                     </a:xfrm>
                     <a:prstGeom prst="rect"/>
                   </pic:spPr>
@@ -364,7 +346,7 @@
         <w:jc w:val="center"/>
       </w:pPr>
       <w:r>
-        <w:t>图1 研究技术路线</w:t>
+        <w:t>图1 平台与教学反馈研究技术路线</w:t>
       </w:r>
     </w:p>
     <w:p>
@@ -377,11 +359,107 @@
     </w:p>
     <w:p>
       <w:pPr>
+        <w:pStyle w:val="Heading2"/>
+      </w:pPr>
+      <w:r>
+        <w:t>5.1 前期完成自有平台基本实现</w:t>
+      </w:r>
+    </w:p>
+    <w:p>
+      <w:pPr>
         <w:widowControl/>
         <w:ind w:firstLine="480"/>
       </w:pPr>
       <w:r>
-        <w:t>三个阶段围绕同一套系统递进：前期建立可运行的基线，中期使用人工数据解释并改进基线错误，后期检验改进方法能否迁移到新课程及持续使用。图2给出阶段关系。</w:t>
+        <w:t>以已有反馈处理代码和开放模型为基础，完成上传、发布、播放、弹幕发送与撤回、分析选择和固定快照，再串联独立音视频模块与报告交互。采用自制视频检查格式与权限，随后取得教师自有或获授权课程开展真实试用。前期至少完成一课从真实互动到模型报告及单条证据回看的完整路径，保留输入范围、快照、模型版本和复现说明。</w:t>
+      </w:r>
+    </w:p>
+    <w:p>
+      <w:pPr>
+        <w:widowControl/>
+        <w:ind w:firstLine="480"/>
+      </w:pPr>
+      <w:r>
+        <w:t>当前已完成平台基本功能及自制短课程的本地模型试跑。下一步重点核对真实课程播放兼容性、不同反馈表达、视频与弹幕时间对齐及教师操作。先对200—300条自然反馈和单列难例试标，完善分类与问题定义，由另一名成员复现同一快照。合成弹幕用于工程验证，不计入真实学生样本或模型准确率。</w:t>
+      </w:r>
+    </w:p>
+    <w:p>
+      <w:pPr>
+        <w:pStyle w:val="Heading2"/>
+      </w:pPr>
+      <w:r>
+        <w:t>5.2 立项至中期开展主要数据与方法研究</w:t>
+      </w:r>
+    </w:p>
+    <w:p>
+      <w:pPr>
+        <w:widowControl/>
+        <w:ind w:firstLine="480"/>
+      </w:pPr>
+      <w:r>
+        <w:t>中期围绕复习、专题讲解和方法训练三类高数教学任务，通过实际课程逐步积累数据。约三万条作为阶段性数据建设目标，实际课程数量、独立参与者数量及反馈规模分别报告，不预设每课自然形成一万条。若反馈不足，优先增加独立课程和观察周期，缩小训练范围；不通过重复刷屏或合成数据补足规模。</w:t>
+      </w:r>
+    </w:p>
+    <w:p>
+      <w:pPr>
+        <w:widowControl/>
+        <w:ind w:firstLine="480"/>
+      </w:pPr>
+      <w:r>
+        <w:t>基础记录进行双人独立标注和分歧仲裁，包括教学相关性、六类标签及教学对象；全部问题进一步标注原文范围、所问对象、条件、否定、多问拆分和关联讲解。抽查非问题记录估计漏检，自然分布样本与补充难例分开统计。标注前测量每条耗时，结合四人可投入时间分批完成，优先保障标准答案质量和独立测试。</w:t>
+      </w:r>
+    </w:p>
+    <w:p>
+      <w:pPr>
+        <w:widowControl/>
+        <w:ind w:firstLine="480"/>
+      </w:pPr>
+      <w:r>
+        <w:t>方法实验比较普通提示、任务提示与少量参数微调，检验隐含求助、多问及混合表达的改善。摘要比较直接摘要、聚类摘要、普通摘要附完整列表和条件保护的覆盖约束摘要，分别报告问题召回、精确率、条件保留与错误合并。音视频比较固定窗、变化候选和语义辅助定位，记录正确关联、拒判、错误引入及实际耗时。大纲加入前后使用相同课程任务比较目标对应和引用支持。</w:t>
+      </w:r>
+    </w:p>
+    <w:p>
+      <w:pPr>
+        <w:widowControl/>
+        <w:ind w:firstLine="480"/>
+      </w:pPr>
+      <w:r>
+        <w:t>训练、开发与测试按课程隔离，另保留未用于选择提示、模型及阈值的独立课程，近重复片段不得跨集合。指标同时报告分子、分母及课程级结果；同课大量弹幕不能替代独立课程数量。对比固定输入、分析范围和摘要字数，报告缓存未命中时的耗时与调用成本，不用缓存命中速度证明模型推理提升。</w:t>
+      </w:r>
+    </w:p>
+    <w:p>
+      <w:pPr>
+        <w:widowControl/>
+        <w:ind w:firstLine="480"/>
+      </w:pPr>
+      <w:r>
+        <w:t>先邀请3—5名教师或助教进行形成性试用，再根据招募及试点结果设计8—12名参与者的任务实验。基础报告与升级报告均可访问相同原始材料，使用难度相近的任务并平衡顺序，主要比较固定时间内依据成立的问题和亮点数量、错误采纳及核查耗时。中期形成标注规范、升级模型与处理方法、组件对照结果、教师评价和论文初稿。</w:t>
+      </w:r>
+    </w:p>
+    <w:p>
+      <w:pPr>
+        <w:pStyle w:val="Heading2"/>
+      </w:pPr>
+      <w:r>
+        <w:t>5.3 中期后开展迁移与校园试点</w:t>
+      </w:r>
+    </w:p>
+    <w:p>
+      <w:pPr>
+        <w:widowControl/>
+        <w:ind w:firstLine="480"/>
+      </w:pPr>
+      <w:r>
+        <w:t>冻结高数阶段方法，选取独立计算机课程先直接测试，再利用少量材料适配并比较，区分原有迁移能力与新增训练作用。进一步完善教师资格、任务队列、访问控制、存储配额、撤回及数据保留程序，完成校园服务器真实接入测试后，为在校师生提供日常便捷教学辅学工具。</w:t>
+      </w:r>
+    </w:p>
+    <w:p>
+      <w:pPr>
+        <w:widowControl/>
+        <w:ind w:firstLine="480"/>
+      </w:pPr>
+      <w:r>
+        <w:t>第三方视频平台连接保留为合作扩展，优先对接授权导出、官方能力或范围明确的数据转交。旧接入代码不作为自动启用或数据使用许可。成果阶段整理可公开代码与规范、撰写论文、办理软件著作权，并在具体技术方案成熟后评估专利；录用、授权与推广规模根据实际结果报告。</w:t>
       </w:r>
     </w:p>
     <w:p>
@@ -392,7 +470,7 @@
       <w:r>
         <w:drawing>
           <wp:inline xmlns:a="http://schemas.openxmlformats.org/drawingml/2006/main" xmlns:pic="http://schemas.openxmlformats.org/drawingml/2006/picture">
-            <wp:extent cx="5652000" cy="1170141"/>
+            <wp:extent cx="5652000" cy="1275816"/>
             <wp:docPr id="2" name="Picture 2"/>
             <wp:cNvGraphicFramePr>
               <a:graphicFrameLocks noChangeAspect="1"/>
@@ -413,7 +491,7 @@
                   <pic:spPr>
                     <a:xfrm>
                       <a:off x="0" y="0"/>
-                      <a:ext cx="5652000" cy="1170141"/>
+                      <a:ext cx="5652000" cy="1275816"/>
                     </a:xfrm>
                     <a:prstGeom prst="rect"/>
                   </pic:spPr>
@@ -436,10 +514,10 @@
     </w:p>
     <w:p>
       <w:pPr>
-        <w:pStyle w:val="Heading2"/>
+        <w:pStyle w:val="Heading1"/>
       </w:pPr>
       <w:r>
-        <w:t>5.1 申报前形成可复现基线并完成针对性核查</w:t>
+        <w:t>六 创新重点与已有条件</w:t>
       </w:r>
     </w:p>
     <w:p>
@@ -448,7 +526,7 @@
         <w:ind w:firstLine="480"/>
       </w:pPr>
       <w:r>
-        <w:t>前期已完成从真实素材到本地报告的基本处理链。后续申报前工作以现有原型、固定快照和已发现错误为基础，优先修复远程接口参数兼容问题，补充异常恢复、模型配置及结果来源记录，使同一课程在明确范围内稳定生成问题清单、讲解概述和可回查报告。完整课程素材处理与模型实际分析范围分别记录，避免用全课下载或转写替代全课语义分析。</w:t>
+        <w:t>第一项研究重点是在教师有限阅读篇幅下保持不同问题的信息需求。通过多问拆分、条件保护、摘要覆盖与原文追溯，比较相同展示预算下保留的信息及错误引入；普通摘要附完整清单作为必要对照，从而区分方法作用与单纯增加列表入口的作用。</w:t>
       </w:r>
     </w:p>
     <w:p>
@@ -457,7 +535,7 @@
         <w:ind w:firstLine="480"/>
       </w:pPr>
       <w:r>
-        <w:t>当前100条试验用于确认输入输出链路，不能用于估计自然反馈比例。下一步在固定快照上按时间段抽取未经文本去重的自然分布样本，另行加入多问、无问号求助、纯情绪、肯定反馈及反讽等难例，人工检查300—500条记录；其中先以200—300条试标完善定义。自然样本与补充难例分开统计，通过核对原文、输出及相关讲解，形成分类、问题抽取、片段定位和摘要错误清单。</w:t>
+        <w:t>第二项研究重点是面向具体疑问的局部多模态取证。通过候选片段定位和按需补证，分析语音、文字和画面分别在何种错误类型下发挥作用，以证据支持、误归属和成本联合评价。自有平台使视频、播放位置及反馈来源能够在同一系统内记录，为复现提供条件；不能仅将平台搭建或通用模型组合宣称为方法创新。</w:t>
       </w:r>
     </w:p>
     <w:p>
@@ -466,15 +544,7 @@
         <w:ind w:firstLine="480"/>
       </w:pPr>
       <w:r>
-        <w:t>申报前基线保留输入快照、抽样索引、模型及提示版本、输出证据编号和教师操作记录，由另一名成员在相同材料上复现。已完成的本地短片段报告作为技术可行性依据；远程全链路、全课语义分析、真实教师大纲和三课数据准备按实际完成情况记录。中期研究由该基线与试标结果启动，无需等待专门训练权重才能开展。</w:t>
-      </w:r>
-    </w:p>
-    <w:p>
-      <w:pPr>
-        <w:pStyle w:val="Heading2"/>
-      </w:pPr>
-      <w:r>
-        <w:t>5.2 立项至中期完成数据建设与方法升级</w:t>
+        <w:t>团队由大连理工大学软件学院四名本科生组成，已有反馈分类、问题清单、模型引用核验与教师报告代码。新平台已实现账号、上传发布、带范围请求的视频播放、弹幕发送与分析选择。在约15秒自制合成课程上，经平台上传和互动形成一个获选问题，使用独立音视频模块得到四段转写、一张画面，再由本地模型生成含问题和讲解概述的报告。该试验验证工程连通性，未评价真实教师材料、学生学习效果或知识点分段准确率。</w:t>
       </w:r>
     </w:p>
     <w:p>
@@ -483,7 +553,7 @@
         <w:ind w:firstLine="480"/>
       </w:pPr>
       <w:r>
-        <w:t>中期以已运行的基础系统、试标规则和错误记录为基础，围绕复习速通、专题讲解、解题方法三类高数视频各一课开展标注，每课目标约一万条，共约三万条。每课约一万条为选材目标，以实际获准快照数量为准，不通过补造或重复记录凑足规模。全部记录进行教学相关性、六类标签和教学对象的基础标注，由两名成员独立判断并仲裁分歧。所有问题候选进一步标注原文范围、所问对象、条件、否定、问题拆分和课程片段；还需抽查被模型判为非问题的记录，以估计早期漏检。</w:t>
+        <w:t>此前第三方课程取得7200条弹幕并完成100条局部本地分析的试验，只保留为既有处理能力记录，不迁移为平台自有课程，也不计入新平台自然样本。团队可租用云GPU，但专用权重尚未训练、校园服务器尚未真实接入，真实教师与学生试用仍需落实。</w:t>
       </w:r>
     </w:p>
     <w:p>
@@ -492,7 +562,15 @@
         <w:ind w:firstLine="480"/>
       </w:pPr>
       <w:r>
-        <w:t>标注结果直接服务三个改进任务。针对隐含求助、多问和混合表达错误，比较原始提示、改进提示与同底座低秩适配微调；低秩适配通过训练少量新增参数调整任务表现，训练前后使用同一独立测试材料比较。针对问题合并和摘要遗漏，建立“原文—问题单元—问题簇—摘要句”的对应关系，比较直接摘要、聚类摘要、普通摘要附完整清单和覆盖约束摘要。针对片段误归属，根据错误类型选择相邻转录、关键帧或原音频，比较固定输入与按需补证。</w:t>
+        <w:t>负责人承担研究统筹与数据治理，三名成员分别负责平台与交互、文本与模型实验、音视频与片段关联；四人交叉承担标注与复现。分工围绕共享数据结构和独立验证衔接，以实际试标耗时调整工作量。</w:t>
+      </w:r>
+    </w:p>
+    <w:p>
+      <w:pPr>
+        <w:pStyle w:val="Heading1"/>
+      </w:pPr>
+      <w:r>
+        <w:t>七 进度成果与经费</w:t>
       </w:r>
     </w:p>
     <w:p>
@@ -501,7 +579,7 @@
         <w:ind w:firstLine="480"/>
       </w:pPr>
       <w:r>
-        <w:t>覆盖约束摘要先为每个问题簇生成候选摘要句，再检查句子是否保留所问对象、条件和否定。在相同字数预算下，优先覆盖不同信息需求，并减少重复表达；无法进入首页的问题仍保留在完整列表中。实验同时报告语义遗漏、错误新增及低频问题保留，避免仅凭编号存在认定信息已经完整表达。局部取证实验则在相近调用预算下比较正确关联与错误引入，证据不充分时允许拒判，同时报告被错误拒绝的正确结果。</w:t>
+        <w:t>申报前完成可复现基本平台与真实课程准备，2026年9月下旬至2027年3月中期检查前集中进行数据建设、方法升级、独立验证和教师研究；中期后进行跨课程迁移、校园部署及成果整理。执行起止时间以学校安排为准，确保成员毕业前结题。</w:t>
       </w:r>
     </w:p>
     <w:p>
@@ -510,148 +588,7 @@
         <w:ind w:firstLine="480"/>
       </w:pPr>
       <w:r>
-        <w:t>核心三课按课程隔离开展三轮验证，每轮两课用于开发、一课用于测试，测试课不参与该轮训练或调整。另规划3—6条新增高数课程作为独立测试，冻结后不用于选择提示、模型和阈值，重复上传或近重复片段不得跨集合。三个核心视频的作者和课型仍可能相互混杂，所以论文分别报告记录规模与独立课程数量，限定推广范围。</w:t>
-      </w:r>
-    </w:p>
-    <w:p>
-      <w:pPr>
-        <w:widowControl/>
-        <w:ind w:firstLine="480"/>
-      </w:pPr>
-      <w:r>
-        <w:t>模型评价围绕教师任务选择指标：问题单元召回检验漏问，精确率检验虚构问题，条件保留与错误合并检验聚合，片段关联与拒判比例检验定位，摘要覆盖与证据支持检验报告。各指标同时报告分子、分母及课程级结果，置信区间以课程或独立任务为抽样单位；同视频弹幕不能视为大量独立课程证据。对比时固定输入、分析范围、提示版本和生成字数，另报告缓存未命中时的处理耗时、调用次数及实际返回用量。另抽取300—500项报告主张进行发现级核验，将自然分布样本与补充难例分开报告。拟先邀请3—5名教师或助教进行形成性试用，再规划8—12名参与者开展任务评价，人数根据招募和试点结果调整。</w:t>
-      </w:r>
-    </w:p>
-    <w:p>
-      <w:pPr>
-        <w:widowControl/>
-        <w:ind w:firstLine="480"/>
-      </w:pPr>
-      <w:r>
-        <w:t>教师实验比较基础报告与升级报告，两组均可访问相同原始材料，并使用不同但难度相近的课程任务、平衡先后顺序。主要观察固定时间内依据成立的问题与亮点数量，同时记录错误发现、核查耗时和行动质量。通过独立评审核验发现及理由，分析系统是否帮助教师更快形成正确判断。中期交付包括标注资料、升级系统、组件对照结果、教师评价与论文初稿；性能提升及创新贡献由这些结果支持。</w:t>
-      </w:r>
-    </w:p>
-    <w:p>
-      <w:pPr>
-        <w:pStyle w:val="Heading2"/>
-      </w:pPr>
-      <w:r>
-        <w:t>5.3 中期后检验迁移与实际使用</w:t>
-      </w:r>
-    </w:p>
-    <w:p>
-      <w:pPr>
-        <w:widowControl/>
-        <w:ind w:firstLine="480"/>
-      </w:pPr>
-      <w:r>
-        <w:t>后期以中期冻结的模型、判定规则和报告系统为基础，规划6—12条计算机课程进行迁移研究。先直接使用高数阶段配置，记录代码、算法步骤和术语造成的错误；再以少量适配材料调整标签示例、检索和必要模型参数，使用独立保留的计算机课程比较适配前后结果。通过这种先测试再适配的顺序，区分原有方法的可迁移能力与新增训练带来的作用。</w:t>
-      </w:r>
-    </w:p>
-    <w:p>
-      <w:pPr>
-        <w:widowControl/>
-        <w:ind w:firstLine="480"/>
-      </w:pPr>
-      <w:r>
-        <w:t>拟与2—3个课程团队开展6—8周持续试用，记录教师查阅哪些证据、接受或推翻哪些判断、实际修改哪些讲解，以及遇到的使用障碍。完善任务恢复、访问控制、资料删除、报告导出和部署说明，使系统能够由课程团队持续操作。教学改进后弹幕变化作为观察资料保存；若研究学习效果，需要另行安排对应测验及可比较条件。</w:t>
-      </w:r>
-    </w:p>
-    <w:p>
-      <w:pPr>
-        <w:widowControl/>
-        <w:ind w:firstLine="480"/>
-      </w:pPr>
-      <w:r>
-        <w:t>成果阶段集中完成研究论文、软件著作权及有具体技术方案支撑的专利评估，按学校要求参加创新赛事，并依据许可范围整理可公开的代码、标注规范和复现材料。推广范围根据稳定性、教师使用结果与材料授权确定，不预先承诺全学科适用。</w:t>
-      </w:r>
-    </w:p>
-    <w:p>
-      <w:pPr>
-        <w:pStyle w:val="Heading1"/>
-      </w:pPr>
-      <w:r>
-        <w:t>六 创新重点与研究条件</w:t>
-      </w:r>
-    </w:p>
-    <w:p>
-      <w:pPr>
-        <w:widowControl/>
-        <w:ind w:firstLine="480"/>
-      </w:pPr>
-      <w:r>
-        <w:t>项目拟验证的主要创新是对教师信息需求进行贯穿处理流程的覆盖控制。既有分类、聚类和检索为基础系统提供能力，本研究进一步将多问拆分、条件保护、摘要覆盖和原文追溯连接起来，检验有限阅读篇幅下能否保留更多不同问题。普通摘要附完整清单被列为必要对照，因此可以区分信息保留方法的作用与单纯增加列表入口的作用。</w:t>
-      </w:r>
-    </w:p>
-    <w:p>
-      <w:pPr>
-        <w:widowControl/>
-        <w:ind w:firstLine="480"/>
-      </w:pPr>
-      <w:r>
-        <w:t>局部多模态取证作为第二项研究重点，为已有问题寻找必要材料。通过记录每次补充证据前后的关联变化，分析哪些歧义适合用转录解决、哪些需要板书或原音频，以及何时应转交教师。该方法与固定多模态输入比较，评价准确性和处理成本。教师任务实验将上述改进与实际复盘联系，验证正确发现和错误采纳，构成方法研究的应用证据。</w:t>
-      </w:r>
-    </w:p>
-    <w:p>
-      <w:pPr>
-        <w:widowControl/>
-        <w:ind w:firstLine="480"/>
-      </w:pPr>
-      <w:r>
-        <w:t>团队由大连理工大学软件学院四名本科生组成，已完成文献整理、判定规则、数据结构、工作台开发及真实素材试验。以BV1Y2DGYoEEw课程为例，已取得约54分钟含音轨视频与7200条带播放时间的弹幕，生成1506段转写草稿及28张画面。在前五分钟范围内，团队从去重文本中按时间等间隔选取100条弹幕，结合153段完整落入该范围的转写和3张画面，使用Qwen3.5-4B完成本地报告生成，得到23个问题单元、25个词云词项和7条积极表达候选。试验记录与抽样范围已保存，可从报告回查单条原文。</w:t>
-      </w:r>
-    </w:p>
-    <w:p>
-      <w:pPr>
-        <w:widowControl/>
-        <w:ind w:firstLine="480"/>
-      </w:pPr>
-      <w:r>
-        <w:t>试验确认了数据获取、模型输出、程序统计和交互回看的连通性，也暴露出具体研究问题：模型曾将“初中物竞可以食用吗”按字面概括为是否可食用，并出现疑问与积极表达误分类，数学转写亦存在术语错误。因此，现有数量仅说明系统产生了相应记录，不能作为准确率或教学效用证据。中期将以这些错误为起点构建难例与对照实验，重点检查上下文补充是否真正纠正误解，还是引入学生未表达的信息。</w:t>
-      </w:r>
-    </w:p>
-    <w:p>
-      <w:pPr>
-        <w:widowControl/>
-        <w:ind w:firstLine="480"/>
-      </w:pPr>
-      <w:r>
-        <w:t>远程API已完成真实模型目录查询和合成文本调用验证，但一次真实课程分析返回参数或能力不匹配，完整远程报告尚待验证。校园模式目前仅完成入口与控制逻辑，未进行真实接入试验；教师大纲尚缺少真实使用评价。FrameScope源码及来源已核验，代码直接复用许可仍需明确。团队具备租用云GPU的条件，可根据标注和基线测试结果选择模型及算力，当前尚未训练专用适配权重。</w:t>
-      </w:r>
-    </w:p>
-    <w:p>
-      <w:pPr>
-        <w:widowControl/>
-        <w:ind w:firstLine="480"/>
-      </w:pPr>
-      <w:r>
-        <w:t>负责人承担研究统筹与数据治理，成员一负责文本处理及模型实验，成员二负责音视频与片段关联，成员三负责报告交互及教师研究；四人交叉承担标注和复现。中期为主要工作阶段：仅三万条基础双标，按每条30—60秒估计约需500—1,000人时，深入标注和仲裁另计。通过试标测量实际耗时，优先保障核心标注及独立测试，再调整候选模型数量和非必要功能。</w:t>
-      </w:r>
-    </w:p>
-    <w:p>
-      <w:pPr>
-        <w:pStyle w:val="Heading1"/>
-      </w:pPr>
-      <w:r>
-        <w:t>七 进度成果与经费安排</w:t>
-      </w:r>
-    </w:p>
-    <w:p>
-      <w:pPr>
-        <w:widowControl/>
-        <w:ind w:firstLine="480"/>
-      </w:pPr>
-      <w:r>
-        <w:t>前期在现有本地闭环基础上稳定系统并完成少量真实核查；2026年9月下旬至2027年3月中期检查前集中完成标注、模型优化、方法实验和教师评价；中期后进行课程迁移、持续试用和成果整理。执行起止时间以正式立项安排为准，并在团队成员毕业前结题。</w:t>
-      </w:r>
-    </w:p>
-    <w:p>
-      <w:pPr>
-        <w:widowControl/>
-        <w:ind w:firstLine="480"/>
-      </w:pPr>
-      <w:r>
-        <w:t>预期形成一套可部署的教师复盘系统，配套三课约三万条基础标注与全部问题深入标注资料、一套判定规范和可复现评价程序。论文围绕问题覆盖、局部取证及教师任务结果展开；录用、知识产权授权和推广规模按实际进展报告。预算金额结合算力实测、导师意见与学校财务规定填写。</w:t>
+        <w:t>预期形成可运行平台、反馈标注资料、问题覆盖与片段关联方法及评价程序。约三万条为逐步积累目标，不作为未经落实的既有资源。经费结合真实算力、存储、标注与教师研究需求确定，预算金额按导师意见和学校财务规定填写。</w:t>
       </w:r>
     </w:p>
     <w:tbl>
@@ -824,7 +761,7 @@
               <w:rPr>
                 <w:sz w:val="21"/>
               </w:rPr>
-              <w:t>开放模型推理、专项训练和受控资料存储</w:t>
+              <w:t>模型推理、专项训练、视频与受控资料存储</w:t>
             </w:r>
           </w:p>
         </w:tc>
@@ -1139,7 +1076,7 @@
         <w:pStyle w:val="Heading1"/>
       </w:pPr>
       <w:r>
-        <w:t>八 数据治理与研究风险</w:t>
+        <w:t>八 权利边界与研究风险</w:t>
       </w:r>
     </w:p>
     <w:p>
@@ -1148,7 +1085,7 @@
         <w:ind w:firstLine="480"/>
       </w:pPr>
       <w:r>
-        <w:t>课程材料取得前核实访问、转交、云端处理和展示权限，记录授权范围及保存期限。研究默认不采集身份字段，对文本中的可识别信息进行必要处理；原文在内部可查看，不代表允许公开展示。参与教师和标注人员按学校程序办理相应同意与伦理事项，模型调用使用受控数据范围。</w:t>
+        <w:t>自有平台仍需核实课程视频、课件、图片与音轨的相应权利。上传声明用于记录责任和范围，不能替代必要的权利证明审核。学生反馈涉及的告知、分析选择、撤回和保存期限按实际研究安排落实，正式试点前完成相应伦理及数据管理程序。原文在平台可见不代表可以公开发布或发送给任意外部模型。</w:t>
       </w:r>
     </w:p>
     <w:p>
@@ -1157,7 +1094,7 @@
         <w:ind w:firstLine="480"/>
       </w:pPr>
       <w:r>
-        <w:t>数据不足时报告实际数量和缺失区间，不以合成记录补足真实样本。转写、公式识别、归属和摘要错误均进入人工核查；规则无法支持结论时保留待核状态。正面与负面发现采用相同证据要求，理解自述限定为文字表达，系统不输出知识掌握率或课程总质量等级。</w:t>
+        <w:t>自然反馈可能稀疏，课程和参与者存在选择偏差，弹幕不能代表所有观看者。转写、画面变化与模型解释均可能出错，所以评价同时保留难例、拒判和错误记录。理解自述限于文字表达，系统不输出真实掌握率、学生心理诊断或课程总质量等级。开展学习效果研究时，需要另行设计对应测验与可比较条件。</w:t>
       </w:r>
     </w:p>
     <w:p>
@@ -1166,7 +1103,7 @@
         <w:ind w:firstLine="480"/>
       </w:pPr>
       <w:r>
-        <w:t>团队使用人工智能工具辅助开发、资料整理与文字编辑，由成员核验来源、代码和研究结果，并按学校及投稿要求披露使用情况。</w:t>
+        <w:t>团队使用人工智能工具辅助开发、资料整理和文字编辑，由成员核验来源、代码及结果，按学校与投稿要求披露使用情况。</w:t>
       </w:r>
     </w:p>
     <w:p>

</xml_diff>

<commit_message>
Complete local demo workflow and update research project materials
</commit_message>
<xml_diff>
--- a/project-materials/04_申报与答辩/申报书_教师反馈主线.docx
+++ b/project-materials/04_申报与答辩/申报书_教师反馈主线.docx
@@ -32,7 +32,7 @@
         <w:widowControl/>
       </w:pPr>
       <w:r>
-        <w:t>项目名称：面向自有网课平台的多模态教学反馈解析与教师复盘系统</w:t>
+        <w:t>项目名称：面向网课教师复盘的多模态反馈解析与轻量化方法研究</w:t>
       </w:r>
     </w:p>
     <w:p>
@@ -129,7 +129,7 @@
         <w:ind w:firstLine="480"/>
       </w:pPr>
       <w:r>
-        <w:t>本项目建设集视频上传、播放与弹幕互动于一体的网课教学平台，研究基于平台内反馈的多模态教师复盘方法。教师上传具有相应使用权的课程，学生在播放位置提问和交流，系统以明确的分析选择形成固定快照，结合课程转写、证据画面和教学大纲生成可回查报告。团队已完成平台基本功能及自制短课程的本地模型闭环。中期通过真实课程逐步积累反馈并开展人工标注，重点研究多问识别、条件保护聚合、摘要覆盖与讲解片段定位，通过独立课程和教师任务检验效果。后期开展计算机课程迁移及校园部署试点，外部视频平台保留为授权合作扩展。项目形成可复现平台、标注规范和研究成果，为教师回应具体疑问、保存有效讲解及制定改进措施提供支持。</w:t>
+        <w:t>本项目面向教师整理网课反馈、定位疑问和核查依据的需求，建设课程上传、播放与弹幕互动平台，研究多模态教学反馈解析的轻量化方法。前期通过通用模型API建立分类、问题提取、讲解关联与有据报告基线；立项后积累高数课程自然反馈，开展人工标注和任务拆分，逐步用轻量专用模型替代关键分析环节。通过课程隔离测试、组件对照和教师任务实验，检验问题覆盖、条件保留及引用支持，并比较延迟、资源和成本。团队已完成自有平台基本功能及自制短视频的本地模型闭环，真实课程API全链路仍需验证。后期开展跨课程迁移与校园部署，为教师保留有效讲解、回应具体疑问和制定改进措施提供可追溯支持。</w:t>
       </w:r>
     </w:p>
     <w:p>
@@ -174,7 +174,7 @@
         <w:ind w:firstLine="480"/>
       </w:pPr>
       <w:r>
-        <w:t>项目集中研究有限阅读篇幅下的问题覆盖与证据定位。上传、播放器和账号系统提供研究环境；多问拆分、条件保护聚合和有据摘要承担方法研究；教师任务实验检验这些改动能否减少遗漏和错误采纳。自建平台不会自动消除版权问题，课程素材及学生数据仍需核实相应处理范围。</w:t>
+        <w:t>项目集中研究有限阅读篇幅下的问题覆盖、证据定位与专门任务的轻量化实现。通用模型提供统一基线，人工标注与任务拆分用于识别可由小模型承担的环节，通过独立对照判断效果与资源之间的关系。上传、播放器和账号系统提供研究环境；多问拆分、条件保护聚合和有据摘要承担方法研究；教师任务实验检验这些改动能否减少遗漏和错误采纳。自建平台不会自动消除版权问题，课程素材及学生数据仍需核实相应处理范围。</w:t>
       </w:r>
     </w:p>
     <w:p>
@@ -209,6 +209,15 @@
       </w:pPr>
       <w:r>
         <w:t>观看和互动不以同意模型分析为前提。弹幕发送时单独选择是否用于本地反馈分析，教师生成报告前冻结已同意且未撤回的记录，保留快照与原弹幕编号映射。新弹幕继续进入平台，留待后续快照分析，避免运行过程中输入变化。撤回后旧报告暂停访问，重新生成时排除相应记录；正式试点前进一步落实历史缓存的保留与删除程序。</w:t>
+      </w:r>
+    </w:p>
+    <w:p>
+      <w:pPr>
+        <w:widowControl/>
+        <w:ind w:firstLine="480"/>
+      </w:pPr>
+      <w:r>
+        <w:t>平台基础设施拟复用MediaCMS的上传、转码与权限能力，并通过独立接口接入课镜的弹幕选择、快照和分析服务。当前已取得源码并完成隔离部署配置校验，服务部署及联调尚未完成；现有平台继续承担基本试验。开源平台属于工程基础，不能直接作为算法创新。</w:t>
       </w:r>
     </w:p>
     <w:p>
@@ -296,7 +305,42 @@
         <w:ind w:firstLine="480"/>
       </w:pPr>
       <w:r>
-        <w:t>图表中的数量由程序计算，模型负责问题概述和有据解释；每项观察与建议保留引用，教师可点击查看单条原文及相关讲解。程序检查编号存在，独立评价检查引用是否支持结论。平台支持本地推理；API仅分析学生同意指定服务的反馈，并须教师确认课程材料范围。真实远程链路与校园部署待验证。</w:t>
+        <w:t>图表中的数量由程序计算，模型负责问题概述和有据解释；每项观察与建议保留引用，教师可点击查看单条原文及相关讲解。程序检查编号存在，独立评价检查引用是否支持结论。前期以通用模型API为主要运行方式，本地推理保留为可选方案。API仅分析学生同意指定服务的反馈，并须教师确认课程材料范围。真实远程链路与校园部署待验证。</w:t>
+      </w:r>
+    </w:p>
+    <w:p>
+      <w:pPr>
+        <w:pStyle w:val="Heading2"/>
+      </w:pPr>
+      <w:r>
+        <w:t>4.4 通用模型基线与轻量专用方法</w:t>
+      </w:r>
+    </w:p>
+    <w:p>
+      <w:pPr>
+        <w:widowControl/>
+        <w:ind w:firstLine="480"/>
+      </w:pPr>
+      <w:r>
+        <w:t>先固定材料快照、分析范围、模型标识、提示与输出结构，通过API完成逐条反馈解析、问题提取及证据报告，保存质量、耗时和费用，形成可重复比较的基线。程序承担数量、筛选、词频和引用编号检查，模型承担语义判断；调用失败时明确保留失败或部分完成范围，不能用占位内容代替实际分析。</w:t>
+      </w:r>
+    </w:p>
+    <w:p>
+      <w:pPr>
+        <w:widowControl/>
+        <w:ind w:firstLine="480"/>
+      </w:pPr>
+      <w:r>
+        <w:t>中期根据人工错误分析拆分分类、问题识别、讲解匹配及聚合摘要任务。优先训练轻量分类与问题识别模型，以播放位置缩小检索范围，再用小型检索或重排模型筛选讲解；条件和否定通过规则与专用模型共同保护。音视频转写及文字公式识别作为可替换的专用组件，分别验证后接入。对于证据不足的记录保留待核状态，API辅助由用户选择并单独记录使用比例。</w:t>
+      </w:r>
+    </w:p>
+    <w:p>
+      <w:pPr>
+        <w:widowControl/>
+        <w:ind w:firstLine="480"/>
+      </w:pPr>
+      <w:r>
+        <w:t>研究比较通用API、未经专项训练的小模型、专项训练的小模型及小模型配合API四类方案。测试前在开发集确定关键指标的可接受差异，冻结模型与辅助触发规则；独立测试同时报告问题召回、条件保留、引用支持、延迟、峰值内存或显存、调用费用及人工复核量。API服务端资源未知时不推断其显存。通过比较检验关键能力保持时能否降低资源消耗，不预先宣称小模型全面优于通用模型。量化、提示优化及专用训练的贡献分别开展消融实验。</w:t>
       </w:r>
     </w:p>
     <w:p>
@@ -307,7 +351,7 @@
       <w:r>
         <w:drawing>
           <wp:inline xmlns:a="http://schemas.openxmlformats.org/drawingml/2006/main" xmlns:pic="http://schemas.openxmlformats.org/drawingml/2006/picture">
-            <wp:extent cx="5040000" cy="6316449"/>
+            <wp:extent cx="5040000" cy="7008897"/>
             <wp:docPr id="1" name="Picture 1"/>
             <wp:cNvGraphicFramePr>
               <a:graphicFrameLocks noChangeAspect="1"/>
@@ -328,7 +372,7 @@
                   <pic:spPr>
                     <a:xfrm>
                       <a:off x="0" y="0"/>
-                      <a:ext cx="5040000" cy="6316449"/>
+                      <a:ext cx="5040000" cy="7008897"/>
                     </a:xfrm>
                     <a:prstGeom prst="rect"/>
                   </pic:spPr>
@@ -362,7 +406,7 @@
         <w:pStyle w:val="Heading2"/>
       </w:pPr>
       <w:r>
-        <w:t>5.1 前期完成自有平台基本实现</w:t>
+        <w:t>5.1 前期完成平台与通用API基线</w:t>
       </w:r>
     </w:p>
     <w:p>
@@ -371,7 +415,7 @@
         <w:ind w:firstLine="480"/>
       </w:pPr>
       <w:r>
-        <w:t>以已有反馈处理代码和开放模型为基础，完成上传、发布、播放、弹幕发送与撤回、分析选择和固定快照，再串联独立音视频模块与报告交互。采用自制视频检查格式与权限，随后取得教师自有或获授权课程开展真实试用。前期至少完成一课从真实互动到模型报告及单条证据回看的完整路径，保留输入范围、快照、模型版本和复现说明。</w:t>
+        <w:t>以已有反馈处理代码、开放转写模型和通用模型API为基础，完成上传、发布、播放、弹幕发送与撤回、分析选择和固定快照，再串联独立音视频模块与报告交互。采用自制视频检查格式与权限，随后取得教师自有或获授权课程开展真实试用。前期至少完成一课从真实互动到模型报告及单条证据回看的完整路径，保留输入范围、快照、模型版本和复现说明。</w:t>
       </w:r>
     </w:p>
     <w:p>
@@ -380,7 +424,7 @@
         <w:ind w:firstLine="480"/>
       </w:pPr>
       <w:r>
-        <w:t>当前已完成平台基本功能及自制短课程的本地模型试跑。下一步重点核对真实课程播放兼容性、不同反馈表达、视频与弹幕时间对齐及教师操作。先对200—300条自然反馈和单列难例试标，完善分类与问题定义，由另一名成员复现同一快照。合成弹幕用于工程验证，不计入真实学生样本或模型准确率。</w:t>
+        <w:t>当前已完成平台基本功能及自制短课程的本地模型试跑。前期尚需完成真实授权课程的API报告闭环，不能将凭证或模型目录查询成功等同于分析成功。下一步重点核对真实课程播放兼容性、不同反馈表达、视频与弹幕时间对齐及教师操作。先对200—300条自然反馈和单列难例试标，完善分类与问题定义，由另一名成员复现同一快照。合成弹幕用于工程验证，不计入真实学生样本或模型准确率。</w:t>
       </w:r>
     </w:p>
     <w:p>
@@ -415,7 +459,7 @@
         <w:ind w:firstLine="480"/>
       </w:pPr>
       <w:r>
-        <w:t>方法实验比较普通提示、任务提示与少量参数微调，检验隐含求助、多问及混合表达的改善。摘要比较直接摘要、聚类摘要、普通摘要附完整列表和条件保护的覆盖约束摘要，分别报告问题召回、精确率、条件保留与错误合并。音视频比较固定窗、变化候选和语义辅助定位，记录正确关联、拒判、错误引入及实际耗时。大纲加入前后使用相同课程任务比较目标对应和引用支持。</w:t>
+        <w:t>方法实验以通用API基线为参照，比较普通小模型、任务提示与轻量模型专项训练，检验隐含求助、多问及混合表达的改善。摘要比较直接摘要、聚类摘要、普通摘要附完整列表和条件保护的覆盖约束摘要，分别报告问题召回、精确率、条件保留与错误合并。音视频比较固定窗、变化候选和语义辅助定位，记录正确关联、拒判、错误引入及实际耗时。大纲加入前后使用相同课程任务比较目标对应和引用支持。</w:t>
       </w:r>
     </w:p>
     <w:p>
@@ -433,7 +477,7 @@
         <w:ind w:firstLine="480"/>
       </w:pPr>
       <w:r>
-        <w:t>先邀请3—5名教师或助教进行形成性试用，再根据招募及试点结果设计8—12名参与者的任务实验。基础报告与升级报告均可访问相同原始材料，使用难度相近的任务并平衡顺序，主要比较固定时间内依据成立的问题和亮点数量、错误采纳及核查耗时。中期形成标注规范、升级模型与处理方法、组件对照结果、教师评价和论文初稿。</w:t>
+        <w:t>先邀请3—5名教师或助教进行形成性试用，再根据招募及试点结果设计8—12名参与者的任务实验。基础报告与升级报告均可访问相同原始材料，使用难度相近的任务并平衡顺序，主要比较固定时间内依据成立的问题和亮点数量、错误采纳及核查耗时。中期形成标注规范、轻量专用模型与处理方法、质量和资源的联合评价、组件对照结果、教师评价和论文初稿。数据建设、专用训练及独立实验构成主要工作量。</w:t>
       </w:r>
     </w:p>
     <w:p>
@@ -470,7 +514,7 @@
       <w:r>
         <w:drawing>
           <wp:inline xmlns:a="http://schemas.openxmlformats.org/drawingml/2006/main" xmlns:pic="http://schemas.openxmlformats.org/drawingml/2006/picture">
-            <wp:extent cx="5652000" cy="1275816"/>
+            <wp:extent cx="5652000" cy="1461015"/>
             <wp:docPr id="2" name="Picture 2"/>
             <wp:cNvGraphicFramePr>
               <a:graphicFrameLocks noChangeAspect="1"/>
@@ -491,7 +535,7 @@
                   <pic:spPr>
                     <a:xfrm>
                       <a:off x="0" y="0"/>
-                      <a:ext cx="5652000" cy="1275816"/>
+                      <a:ext cx="5652000" cy="1461015"/>
                     </a:xfrm>
                     <a:prstGeom prst="rect"/>
                   </pic:spPr>
@@ -526,7 +570,7 @@
         <w:ind w:firstLine="480"/>
       </w:pPr>
       <w:r>
-        <w:t>第一项研究重点是在教师有限阅读篇幅下保持不同问题的信息需求。通过多问拆分、条件保护、摘要覆盖与原文追溯，比较相同展示预算下保留的信息及错误引入；普通摘要附完整清单作为必要对照，从而区分方法作用与单纯增加列表入口的作用。</w:t>
+        <w:t>第一项研究重点是在有限资源及教师阅读篇幅下保持不同问题的信息需求。通过通用API与轻量专用模型对照，检验任务专门化能否改善问题识别的质量与计算效率。通过多问拆分、条件保护、摘要覆盖与原文追溯，比较相同展示预算下保留的信息及错误引入；普通摘要附完整清单作为必要对照，从而区分方法作用与单纯增加列表入口的作用。</w:t>
       </w:r>
     </w:p>
     <w:p>
@@ -553,7 +597,7 @@
         <w:ind w:firstLine="480"/>
       </w:pPr>
       <w:r>
-        <w:t>此前第三方课程取得7200条弹幕并完成100条局部本地分析的试验，只保留为既有处理能力记录，不迁移为平台自有课程，也不计入新平台自然样本。团队可租用云GPU，但专用权重尚未训练、校园服务器尚未真实接入，真实教师与学生试用仍需落实。</w:t>
+        <w:t>此前第三方课程取得7200条弹幕并完成100条局部本地分析的试验，只保留为既有处理能力记录，不迁移为平台自有课程，也不计入新平台自然样本。团队可租用云GPU，但专用权重尚未训练、校园服务器尚未真实接入，真实教师与学生试用仍需落实。MediaCMS接入目前受本机容器引擎启动故障影响，尚未替换现有平台；此问题不作为已完成部署报告。</w:t>
       </w:r>
     </w:p>
     <w:p>
@@ -588,7 +632,7 @@
         <w:ind w:firstLine="480"/>
       </w:pPr>
       <w:r>
-        <w:t>预期形成可运行平台、反馈标注资料、问题覆盖与片段关联方法及评价程序。约三万条为逐步积累目标，不作为未经落实的既有资源。经费结合真实算力、存储、标注与教师研究需求确定，预算金额按导师意见和学校财务规定填写。</w:t>
+        <w:t>预期形成可运行平台、反馈标注资料、轻量专用反馈模型、问题覆盖与片段关联方法及评价程序。约三万条为逐步积累目标，不作为未经落实的既有资源。经费结合真实算力、存储、标注与教师研究需求确定，预算金额按导师意见和学校财务规定填写。</w:t>
       </w:r>
     </w:p>
     <w:tbl>

</xml_diff>